<commit_message>
Add M2 baseline review - resolve FR-011 and NFR-002 overlap, tighten FR-002 transitions, flag NFR-005 and NFR-006 as pending
</commit_message>
<xml_diff>
--- a/docs/declarations/templates/AI DECLARATION.docx
+++ b/docs/declarations/templates/AI DECLARATION.docx
@@ -1,6 +1,6 @@
 
 <file path=word/document.xml><?xml version="1.0" encoding="utf-8"?>
-<w:document xmlns:wpc="http://schemas.microsoft.com/office/word/2010/wordprocessingCanvas" xmlns:cx="http://schemas.microsoft.com/office/drawing/2014/chartex" xmlns:mc="http://schemas.openxmlformats.org/markup-compatibility/2006" xmlns:o="urn:schemas-microsoft-com:office:office" xmlns:r="http://schemas.openxmlformats.org/officeDocument/2006/relationships" xmlns:m="http://schemas.openxmlformats.org/officeDocument/2006/math" xmlns:v="urn:schemas-microsoft-com:vml" xmlns:wp14="http://schemas.microsoft.com/office/word/2010/wordprocessingDrawing" xmlns:wp="http://schemas.openxmlformats.org/drawingml/2006/wordprocessingDrawing" xmlns:w10="urn:schemas-microsoft-com:office:word" xmlns:w="http://schemas.openxmlformats.org/wordprocessingml/2006/main" xmlns:w14="http://schemas.microsoft.com/office/word/2010/wordml" xmlns:w15="http://schemas.microsoft.com/office/word/2012/wordml" xmlns:w16se="http://schemas.microsoft.com/office/word/2015/wordml/symex" xmlns:wpg="http://schemas.microsoft.com/office/word/2010/wordprocessingGroup" xmlns:wpi="http://schemas.microsoft.com/office/word/2010/wordprocessingInk" xmlns:wne="http://schemas.microsoft.com/office/word/2006/wordml" xmlns:wps="http://schemas.microsoft.com/office/word/2010/wordprocessingShape" mc:Ignorable="w14 w15 w16se wp14">
+<w:document xmlns:wpc="http://schemas.microsoft.com/office/word/2010/wordprocessingCanvas" xmlns:cx="http://schemas.microsoft.com/office/drawing/2014/chartex" xmlns:cx1="http://schemas.microsoft.com/office/drawing/2015/9/8/chartex" xmlns:cx2="http://schemas.microsoft.com/office/drawing/2015/10/21/chartex" xmlns:cx3="http://schemas.microsoft.com/office/drawing/2016/5/9/chartex" xmlns:cx4="http://schemas.microsoft.com/office/drawing/2016/5/10/chartex" xmlns:cx5="http://schemas.microsoft.com/office/drawing/2016/5/11/chartex" xmlns:cx6="http://schemas.microsoft.com/office/drawing/2016/5/12/chartex" xmlns:cx7="http://schemas.microsoft.com/office/drawing/2016/5/13/chartex" xmlns:cx8="http://schemas.microsoft.com/office/drawing/2016/5/14/chartex" xmlns:mc="http://schemas.openxmlformats.org/markup-compatibility/2006" xmlns:aink="http://schemas.microsoft.com/office/drawing/2016/ink" xmlns:am3d="http://schemas.microsoft.com/office/drawing/2017/model3d" xmlns:o="urn:schemas-microsoft-com:office:office" xmlns:oel="http://schemas.microsoft.com/office/2019/extlst" xmlns:r="http://schemas.openxmlformats.org/officeDocument/2006/relationships" xmlns:m="http://schemas.openxmlformats.org/officeDocument/2006/math" xmlns:v="urn:schemas-microsoft-com:vml" xmlns:wp14="http://schemas.microsoft.com/office/word/2010/wordprocessingDrawing" xmlns:wp="http://schemas.openxmlformats.org/drawingml/2006/wordprocessingDrawing" xmlns:w10="urn:schemas-microsoft-com:office:word" xmlns:w="http://schemas.openxmlformats.org/wordprocessingml/2006/main" xmlns:w14="http://schemas.microsoft.com/office/word/2010/wordml" xmlns:w15="http://schemas.microsoft.com/office/word/2012/wordml" xmlns:w16cex="http://schemas.microsoft.com/office/word/2018/wordml/cex" xmlns:w16cid="http://schemas.microsoft.com/office/word/2016/wordml/cid" xmlns:w16="http://schemas.microsoft.com/office/word/2018/wordml" xmlns:w16du="http://schemas.microsoft.com/office/word/2023/wordml/word16du" xmlns:w16sdtdh="http://schemas.microsoft.com/office/word/2020/wordml/sdtdatahash" xmlns:w16sdtfl="http://schemas.microsoft.com/office/word/2024/wordml/sdtformatlock" xmlns:w16se="http://schemas.microsoft.com/office/word/2015/wordml/symex" xmlns:wpg="http://schemas.microsoft.com/office/word/2010/wordprocessingGroup" xmlns:wpi="http://schemas.microsoft.com/office/word/2010/wordprocessingInk" xmlns:wne="http://schemas.microsoft.com/office/word/2006/wordml" xmlns:wps="http://schemas.microsoft.com/office/word/2010/wordprocessingShape" mc:Ignorable="w14 w15 w16se w16cid w16 w16cex w16sdtdh w16sdtfl w16du wp14">
   <w:body>
     <w:p>
       <w:pPr>
@@ -65,10 +65,15 @@
             <w:docPart w:val="DefaultPlaceholder_-1854013440"/>
           </w:placeholder>
         </w:sdtPr>
-        <w:sdtEndPr/>
         <w:sdtContent>
           <w:r>
             <w:t>docs/</w:t>
+          </w:r>
+          <w:r>
+            <w:t>m2-baseline-review</w:t>
+          </w:r>
+          <w:r>
+            <w:t>-2.0</w:t>
           </w:r>
         </w:sdtContent>
       </w:sdt>
@@ -76,15 +81,22 @@
     <w:p>
       <w:pPr>
         <w:spacing w:line="360" w:lineRule="auto"/>
+        <w:rPr>
+          <w:lang w:val="nl-NL"/>
+        </w:rPr>
       </w:pPr>
       <w:r>
         <w:rPr>
           <w:b/>
           <w:bCs/>
+          <w:lang w:val="nl-NL"/>
         </w:rPr>
         <w:t>Student Name:</w:t>
       </w:r>
       <w:r>
+        <w:rPr>
+          <w:lang w:val="nl-NL"/>
+        </w:rPr>
         <w:t xml:space="preserve"> </w:t>
       </w:r>
       <w:sdt>
@@ -94,10 +106,12 @@
             <w:docPart w:val="DefaultPlaceholder_-1854013440"/>
           </w:placeholder>
         </w:sdtPr>
-        <w:sdtEndPr/>
         <w:sdtContent>
           <w:r>
-            <w:t>Jimmy Junior Baloyi</w:t>
+            <w:rPr>
+              <w:lang w:val="nl-NL"/>
+            </w:rPr>
+            <w:t>Karabo Masoka</w:t>
           </w:r>
         </w:sdtContent>
       </w:sdt>
@@ -105,15 +119,22 @@
     <w:p>
       <w:pPr>
         <w:spacing w:line="360" w:lineRule="auto"/>
+        <w:rPr>
+          <w:lang w:val="nl-NL"/>
+        </w:rPr>
       </w:pPr>
       <w:r>
         <w:rPr>
           <w:b/>
           <w:bCs/>
+          <w:lang w:val="nl-NL"/>
         </w:rPr>
         <w:t>Student Number:</w:t>
       </w:r>
       <w:r>
+        <w:rPr>
+          <w:lang w:val="nl-NL"/>
+        </w:rPr>
         <w:t xml:space="preserve"> </w:t>
       </w:r>
       <w:sdt>
@@ -123,10 +144,18 @@
             <w:docPart w:val="DefaultPlaceholder_-1854013440"/>
           </w:placeholder>
         </w:sdtPr>
-        <w:sdtEndPr/>
         <w:sdtContent>
           <w:r>
-            <w:t>601713</w:t>
+            <w:rPr>
+              <w:lang w:val="nl-NL"/>
+            </w:rPr>
+            <w:t>6</w:t>
+          </w:r>
+          <w:r>
+            <w:rPr>
+              <w:lang w:val="nl-NL"/>
+            </w:rPr>
+            <w:t>01644</w:t>
           </w:r>
         </w:sdtContent>
       </w:sdt>
@@ -181,14 +210,20 @@
             <w:docPart w:val="DefaultPlaceholder_-1854013440"/>
           </w:placeholder>
         </w:sdtPr>
-        <w:sdtEndPr/>
         <w:sdtContent>
           <w:r>
             <w:rPr>
               <w:b/>
               <w:bCs/>
             </w:rPr>
-            <w:t>03</w:t>
+            <w:t>0</w:t>
+          </w:r>
+          <w:r>
+            <w:rPr>
+              <w:b/>
+              <w:bCs/>
+            </w:rPr>
+            <w:t>5</w:t>
           </w:r>
         </w:sdtContent>
       </w:sdt>
@@ -234,7 +269,6 @@
             <w14:uncheckedState w14:val="2610" w14:font="MS Gothic"/>
           </w14:checkbox>
         </w:sdtPr>
-        <w:sdtEndPr/>
         <w:sdtContent>
           <w:r>
             <w:rPr>
@@ -295,10 +329,9 @@
             <w:docPart w:val="DefaultPlaceholder_-1854013440"/>
           </w:placeholder>
         </w:sdtPr>
-        <w:sdtEndPr/>
         <w:sdtContent>
           <w:r>
-            <w:t>Jimmy Junior Baloyi</w:t>
+            <w:t>Karabo Masoka</w:t>
           </w:r>
         </w:sdtContent>
       </w:sdt>
@@ -323,17 +356,19 @@
           <w:placeholder>
             <w:docPart w:val="DefaultPlaceholder_-1854013437"/>
           </w:placeholder>
-          <w:date w:fullDate="2026-09-09T00:00:00Z">
+          <w:date w:fullDate="2026-09-29T00:00:00Z">
             <w:dateFormat w:val="yyyy/MM/dd"/>
             <w:lid w:val="en-ZA"/>
             <w:storeMappedDataAs w:val="dateTime"/>
             <w:calendar w:val="gregorian"/>
           </w:date>
         </w:sdtPr>
-        <w:sdtEndPr/>
         <w:sdtContent>
           <w:r>
-            <w:t>2026/09/09</w:t>
+            <w:t>2026/09/</w:t>
+          </w:r>
+          <w:r>
+            <w:t>29</w:t>
           </w:r>
         </w:sdtContent>
       </w:sdt>
@@ -349,7 +384,7 @@
 </file>
 
 <file path=word/styles.xml><?xml version="1.0" encoding="utf-8"?>
-<w:styles xmlns:mc="http://schemas.openxmlformats.org/markup-compatibility/2006" xmlns:r="http://schemas.openxmlformats.org/officeDocument/2006/relationships" xmlns:w="http://schemas.openxmlformats.org/wordprocessingml/2006/main" xmlns:w14="http://schemas.microsoft.com/office/word/2010/wordml" xmlns:w15="http://schemas.microsoft.com/office/word/2012/wordml" xmlns:w16se="http://schemas.microsoft.com/office/word/2015/wordml/symex" mc:Ignorable="w14 w15 w16se">
+<w:styles xmlns:mc="http://schemas.openxmlformats.org/markup-compatibility/2006" xmlns:r="http://schemas.openxmlformats.org/officeDocument/2006/relationships" xmlns:w="http://schemas.openxmlformats.org/wordprocessingml/2006/main" xmlns:w14="http://schemas.microsoft.com/office/word/2010/wordml" xmlns:w15="http://schemas.microsoft.com/office/word/2012/wordml" xmlns:w16cex="http://schemas.microsoft.com/office/word/2018/wordml/cex" xmlns:w16cid="http://schemas.microsoft.com/office/word/2016/wordml/cid" xmlns:w16="http://schemas.microsoft.com/office/word/2018/wordml" xmlns:w16du="http://schemas.microsoft.com/office/word/2023/wordml/word16du" xmlns:w16sdtdh="http://schemas.microsoft.com/office/word/2020/wordml/sdtdatahash" xmlns:w16sdtfl="http://schemas.microsoft.com/office/word/2024/wordml/sdtformatlock" xmlns:w16se="http://schemas.microsoft.com/office/word/2015/wordml/symex" mc:Ignorable="w14 w15 w16se w16cid w16 w16cex w16sdtdh w16sdtfl w16du">
   <w:docDefaults>
     <w:rPrDefault>
       <w:rPr>
@@ -367,7 +402,7 @@
       </w:pPr>
     </w:pPrDefault>
   </w:docDefaults>
-  <w:latentStyles w:defLockedState="0" w:defUIPriority="99" w:defSemiHidden="0" w:defUnhideWhenUsed="0" w:defQFormat="0" w:count="371">
+  <w:latentStyles w:defLockedState="0" w:defUIPriority="99" w:defSemiHidden="0" w:defUnhideWhenUsed="0" w:defQFormat="0" w:count="376">
     <w:lsdException w:name="Normal" w:uiPriority="0" w:qFormat="1"/>
     <w:lsdException w:name="heading 1" w:uiPriority="9" w:qFormat="1"/>
     <w:lsdException w:name="heading 2" w:semiHidden="1" w:uiPriority="9" w:unhideWhenUsed="1" w:qFormat="1"/>
@@ -739,6 +774,11 @@
     <w:lsdException w:name="List Table 5 Dark Accent 6" w:uiPriority="50"/>
     <w:lsdException w:name="List Table 6 Colorful Accent 6" w:uiPriority="51"/>
     <w:lsdException w:name="List Table 7 Colorful Accent 6" w:uiPriority="52"/>
+    <w:lsdException w:name="Mention" w:semiHidden="1" w:unhideWhenUsed="1"/>
+    <w:lsdException w:name="Smart Hyperlink" w:semiHidden="1" w:unhideWhenUsed="1"/>
+    <w:lsdException w:name="Hashtag" w:semiHidden="1" w:unhideWhenUsed="1"/>
+    <w:lsdException w:name="Unresolved Mention" w:semiHidden="1" w:unhideWhenUsed="1"/>
+    <w:lsdException w:name="Smart Link" w:semiHidden="1" w:unhideWhenUsed="1"/>
   </w:latentStyles>
   <w:style w:type="paragraph" w:default="1" w:styleId="Normal">
     <w:name w:val="Normal"/>
@@ -1274,7 +1314,7 @@
 </file>
 
 <file path=word/glossary/document.xml><?xml version="1.0" encoding="utf-8"?>
-<w:glossaryDocument xmlns:wpc="http://schemas.microsoft.com/office/word/2010/wordprocessingCanvas" xmlns:cx="http://schemas.microsoft.com/office/drawing/2014/chartex" xmlns:mc="http://schemas.openxmlformats.org/markup-compatibility/2006" xmlns:o="urn:schemas-microsoft-com:office:office" xmlns:r="http://schemas.openxmlformats.org/officeDocument/2006/relationships" xmlns:m="http://schemas.openxmlformats.org/officeDocument/2006/math" xmlns:v="urn:schemas-microsoft-com:vml" xmlns:wp14="http://schemas.microsoft.com/office/word/2010/wordprocessingDrawing" xmlns:wp="http://schemas.openxmlformats.org/drawingml/2006/wordprocessingDrawing" xmlns:w10="urn:schemas-microsoft-com:office:word" xmlns:w="http://schemas.openxmlformats.org/wordprocessingml/2006/main" xmlns:w14="http://schemas.microsoft.com/office/word/2010/wordml" xmlns:w15="http://schemas.microsoft.com/office/word/2012/wordml" xmlns:w16se="http://schemas.microsoft.com/office/word/2015/wordml/symex" xmlns:wpg="http://schemas.microsoft.com/office/word/2010/wordprocessingGroup" xmlns:wpi="http://schemas.microsoft.com/office/word/2010/wordprocessingInk" xmlns:wne="http://schemas.microsoft.com/office/word/2006/wordml" xmlns:wps="http://schemas.microsoft.com/office/word/2010/wordprocessingShape" mc:Ignorable="w14 w15 w16se wp14">
+<w:glossaryDocument xmlns:wpc="http://schemas.microsoft.com/office/word/2010/wordprocessingCanvas" xmlns:cx="http://schemas.microsoft.com/office/drawing/2014/chartex" xmlns:cx1="http://schemas.microsoft.com/office/drawing/2015/9/8/chartex" xmlns:cx2="http://schemas.microsoft.com/office/drawing/2015/10/21/chartex" xmlns:cx3="http://schemas.microsoft.com/office/drawing/2016/5/9/chartex" xmlns:cx4="http://schemas.microsoft.com/office/drawing/2016/5/10/chartex" xmlns:cx5="http://schemas.microsoft.com/office/drawing/2016/5/11/chartex" xmlns:cx6="http://schemas.microsoft.com/office/drawing/2016/5/12/chartex" xmlns:cx7="http://schemas.microsoft.com/office/drawing/2016/5/13/chartex" xmlns:cx8="http://schemas.microsoft.com/office/drawing/2016/5/14/chartex" xmlns:mc="http://schemas.openxmlformats.org/markup-compatibility/2006" xmlns:aink="http://schemas.microsoft.com/office/drawing/2016/ink" xmlns:am3d="http://schemas.microsoft.com/office/drawing/2017/model3d" xmlns:o="urn:schemas-microsoft-com:office:office" xmlns:oel="http://schemas.microsoft.com/office/2019/extlst" xmlns:r="http://schemas.openxmlformats.org/officeDocument/2006/relationships" xmlns:m="http://schemas.openxmlformats.org/officeDocument/2006/math" xmlns:v="urn:schemas-microsoft-com:vml" xmlns:wp14="http://schemas.microsoft.com/office/word/2010/wordprocessingDrawing" xmlns:wp="http://schemas.openxmlformats.org/drawingml/2006/wordprocessingDrawing" xmlns:w10="urn:schemas-microsoft-com:office:word" xmlns:w="http://schemas.openxmlformats.org/wordprocessingml/2006/main" xmlns:w14="http://schemas.microsoft.com/office/word/2010/wordml" xmlns:w15="http://schemas.microsoft.com/office/word/2012/wordml" xmlns:w16cex="http://schemas.microsoft.com/office/word/2018/wordml/cex" xmlns:w16cid="http://schemas.microsoft.com/office/word/2016/wordml/cid" xmlns:w16="http://schemas.microsoft.com/office/word/2018/wordml" xmlns:w16du="http://schemas.microsoft.com/office/word/2023/wordml/word16du" xmlns:w16sdtdh="http://schemas.microsoft.com/office/word/2020/wordml/sdtdatahash" xmlns:w16sdtfl="http://schemas.microsoft.com/office/word/2024/wordml/sdtformatlock" xmlns:w16se="http://schemas.microsoft.com/office/word/2015/wordml/symex" xmlns:wpg="http://schemas.microsoft.com/office/word/2010/wordprocessingGroup" xmlns:wpi="http://schemas.microsoft.com/office/word/2010/wordprocessingInk" xmlns:wne="http://schemas.microsoft.com/office/word/2006/wordml" xmlns:wps="http://schemas.microsoft.com/office/word/2010/wordprocessingShape" mc:Ignorable="w14 w15 w16se w16cid w16 w16cex w16sdtdh w16sdtfl w16du wp14">
   <w:docParts>
     <w:docPart>
       <w:docPartPr>
@@ -1333,13 +1373,12 @@
 </file>
 
 <file path=word/glossary/fontTable.xml><?xml version="1.0" encoding="utf-8"?>
-<w:fonts xmlns:mc="http://schemas.openxmlformats.org/markup-compatibility/2006" xmlns:r="http://schemas.openxmlformats.org/officeDocument/2006/relationships" xmlns:w="http://schemas.openxmlformats.org/wordprocessingml/2006/main" xmlns:w14="http://schemas.microsoft.com/office/word/2010/wordml" xmlns:w15="http://schemas.microsoft.com/office/word/2012/wordml" xmlns:w16se="http://schemas.microsoft.com/office/word/2015/wordml/symex" mc:Ignorable="w14 w15 w16se">
+<w:fonts xmlns:mc="http://schemas.openxmlformats.org/markup-compatibility/2006" xmlns:r="http://schemas.openxmlformats.org/officeDocument/2006/relationships" xmlns:w="http://schemas.openxmlformats.org/wordprocessingml/2006/main" xmlns:w14="http://schemas.microsoft.com/office/word/2010/wordml" xmlns:w15="http://schemas.microsoft.com/office/word/2012/wordml" xmlns:w16cex="http://schemas.microsoft.com/office/word/2018/wordml/cex" xmlns:w16cid="http://schemas.microsoft.com/office/word/2016/wordml/cid" xmlns:w16="http://schemas.microsoft.com/office/word/2018/wordml" xmlns:w16du="http://schemas.microsoft.com/office/word/2023/wordml/word16du" xmlns:w16sdtdh="http://schemas.microsoft.com/office/word/2020/wordml/sdtdatahash" xmlns:w16sdtfl="http://schemas.microsoft.com/office/word/2024/wordml/sdtformatlock" xmlns:w16se="http://schemas.microsoft.com/office/word/2015/wordml/symex" mc:Ignorable="w14 w15 w16se w16cid w16 w16cex w16sdtdh w16sdtfl w16du">
   <w:font w:name="Aptos">
-    <w:altName w:val="Arial"/>
     <w:charset w:val="00"/>
     <w:family w:val="swiss"/>
     <w:pitch w:val="variable"/>
-    <w:sig w:usb0="00000001" w:usb1="00000003" w:usb2="00000000" w:usb3="00000000" w:csb0="0000019F" w:csb1="00000000"/>
+    <w:sig w:usb0="20000287" w:usb1="00000003" w:usb2="00000000" w:usb3="00000000" w:csb0="0000019F" w:csb1="00000000"/>
   </w:font>
   <w:font w:name="Times New Roman">
     <w:panose1 w:val="02020603050405020304"/>
@@ -1349,11 +1388,10 @@
     <w:sig w:usb0="E0002EFF" w:usb1="C000785B" w:usb2="00000009" w:usb3="00000000" w:csb0="000001FF" w:csb1="00000000"/>
   </w:font>
   <w:font w:name="Aptos Display">
-    <w:altName w:val="Arial"/>
     <w:charset w:val="00"/>
     <w:family w:val="swiss"/>
     <w:pitch w:val="variable"/>
-    <w:sig w:usb0="00000001" w:usb1="00000003" w:usb2="00000000" w:usb3="00000000" w:csb0="0000019F" w:csb1="00000000"/>
+    <w:sig w:usb0="20000287" w:usb1="00000003" w:usb2="00000000" w:usb3="00000000" w:csb0="0000019F" w:csb1="00000000"/>
   </w:font>
   <w:font w:name="MS Gothic">
     <w:altName w:val="ＭＳ ゴシック"/>
@@ -1363,25 +1401,11 @@
     <w:pitch w:val="fixed"/>
     <w:sig w:usb0="E00002FF" w:usb1="6AC7FDFB" w:usb2="08000012" w:usb3="00000000" w:csb0="0002009F" w:csb1="00000000"/>
   </w:font>
-  <w:font w:name="Calibri">
-    <w:panose1 w:val="020F0502020204030204"/>
-    <w:charset w:val="00"/>
-    <w:family w:val="swiss"/>
-    <w:pitch w:val="variable"/>
-    <w:sig w:usb0="E4002EFF" w:usb1="C200247B" w:usb2="00000009" w:usb3="00000000" w:csb0="000001FF" w:csb1="00000000"/>
-  </w:font>
-  <w:font w:name="Calibri Light">
-    <w:panose1 w:val="020F0302020204030204"/>
-    <w:charset w:val="00"/>
-    <w:family w:val="swiss"/>
-    <w:pitch w:val="variable"/>
-    <w:sig w:usb0="E4002EFF" w:usb1="C200247B" w:usb2="00000009" w:usb3="00000000" w:csb0="000001FF" w:csb1="00000000"/>
-  </w:font>
 </w:fonts>
 </file>
 
 <file path=word/glossary/settings.xml><?xml version="1.0" encoding="utf-8"?>
-<w:settings xmlns:mc="http://schemas.openxmlformats.org/markup-compatibility/2006" xmlns:o="urn:schemas-microsoft-com:office:office" xmlns:r="http://schemas.openxmlformats.org/officeDocument/2006/relationships" xmlns:m="http://schemas.openxmlformats.org/officeDocument/2006/math" xmlns:v="urn:schemas-microsoft-com:vml" xmlns:w10="urn:schemas-microsoft-com:office:word" xmlns:w="http://schemas.openxmlformats.org/wordprocessingml/2006/main" xmlns:w14="http://schemas.microsoft.com/office/word/2010/wordml" xmlns:w15="http://schemas.microsoft.com/office/word/2012/wordml" xmlns:w16se="http://schemas.microsoft.com/office/word/2015/wordml/symex" xmlns:sl="http://schemas.openxmlformats.org/schemaLibrary/2006/main" mc:Ignorable="w14 w15 w16se">
+<w:settings xmlns:mc="http://schemas.openxmlformats.org/markup-compatibility/2006" xmlns:o="urn:schemas-microsoft-com:office:office" xmlns:r="http://schemas.openxmlformats.org/officeDocument/2006/relationships" xmlns:m="http://schemas.openxmlformats.org/officeDocument/2006/math" xmlns:v="urn:schemas-microsoft-com:vml" xmlns:w10="urn:schemas-microsoft-com:office:word" xmlns:w="http://schemas.openxmlformats.org/wordprocessingml/2006/main" xmlns:w14="http://schemas.microsoft.com/office/word/2010/wordml" xmlns:w15="http://schemas.microsoft.com/office/word/2012/wordml" xmlns:w16cex="http://schemas.microsoft.com/office/word/2018/wordml/cex" xmlns:w16cid="http://schemas.microsoft.com/office/word/2016/wordml/cid" xmlns:w16="http://schemas.microsoft.com/office/word/2018/wordml" xmlns:w16du="http://schemas.microsoft.com/office/word/2023/wordml/word16du" xmlns:w16sdtdh="http://schemas.microsoft.com/office/word/2020/wordml/sdtdatahash" xmlns:w16sdtfl="http://schemas.microsoft.com/office/word/2024/wordml/sdtformatlock" xmlns:w16se="http://schemas.microsoft.com/office/word/2015/wordml/symex" xmlns:sl="http://schemas.openxmlformats.org/schemaLibrary/2006/main" mc:Ignorable="w14 w15 w16se w16cid w16 w16cex w16sdtdh w16sdtfl w16du">
   <w:view w:val="normal"/>
   <w:defaultTabStop w:val="720"/>
   <w:characterSpacingControl w:val="doNotCompress"/>
@@ -1392,11 +1416,14 @@
     <w:compatSetting w:name="enableOpenTypeFeatures" w:uri="http://schemas.microsoft.com/office/word" w:val="1"/>
     <w:compatSetting w:name="doNotFlipMirrorIndents" w:uri="http://schemas.microsoft.com/office/word" w:val="1"/>
     <w:compatSetting w:name="differentiateMultirowTableHeaders" w:uri="http://schemas.microsoft.com/office/word" w:val="1"/>
+    <w:compatSetting w:name="useWord2013TrackBottomHyphenation" w:uri="http://schemas.microsoft.com/office/word" w:val="1"/>
   </w:compat>
   <w:rsids>
     <w:rsidRoot w:val="006573DA"/>
+    <w:rsid w:val="00140EB4"/>
     <w:rsid w:val="003D50F4"/>
     <w:rsid w:val="006573DA"/>
+    <w:rsid w:val="00B823D9"/>
     <w:rsid w:val="00B958DB"/>
     <w:rsid w:val="00CD62E1"/>
     <w:rsid w:val="00E063BC"/>
@@ -1424,7 +1451,7 @@
 </file>
 
 <file path=word/glossary/styles.xml><?xml version="1.0" encoding="utf-8"?>
-<w:styles xmlns:mc="http://schemas.openxmlformats.org/markup-compatibility/2006" xmlns:r="http://schemas.openxmlformats.org/officeDocument/2006/relationships" xmlns:w="http://schemas.openxmlformats.org/wordprocessingml/2006/main" xmlns:w14="http://schemas.microsoft.com/office/word/2010/wordml" xmlns:w15="http://schemas.microsoft.com/office/word/2012/wordml" xmlns:w16se="http://schemas.microsoft.com/office/word/2015/wordml/symex" mc:Ignorable="w14 w15 w16se">
+<w:styles xmlns:mc="http://schemas.openxmlformats.org/markup-compatibility/2006" xmlns:r="http://schemas.openxmlformats.org/officeDocument/2006/relationships" xmlns:w="http://schemas.openxmlformats.org/wordprocessingml/2006/main" xmlns:w14="http://schemas.microsoft.com/office/word/2010/wordml" xmlns:w15="http://schemas.microsoft.com/office/word/2012/wordml" xmlns:w16cex="http://schemas.microsoft.com/office/word/2018/wordml/cex" xmlns:w16cid="http://schemas.microsoft.com/office/word/2016/wordml/cid" xmlns:w16="http://schemas.microsoft.com/office/word/2018/wordml" xmlns:w16du="http://schemas.microsoft.com/office/word/2023/wordml/word16du" xmlns:w16sdtdh="http://schemas.microsoft.com/office/word/2020/wordml/sdtdatahash" xmlns:w16sdtfl="http://schemas.microsoft.com/office/word/2024/wordml/sdtformatlock" xmlns:w16se="http://schemas.microsoft.com/office/word/2015/wordml/symex" mc:Ignorable="w14 w15 w16se w16cid w16 w16cex w16sdtdh w16sdtfl w16du">
   <w:docDefaults>
     <w:rPrDefault>
       <w:rPr>
@@ -1442,7 +1469,7 @@
       </w:pPr>
     </w:pPrDefault>
   </w:docDefaults>
-  <w:latentStyles w:defLockedState="0" w:defUIPriority="99" w:defSemiHidden="0" w:defUnhideWhenUsed="0" w:defQFormat="0" w:count="371">
+  <w:latentStyles w:defLockedState="0" w:defUIPriority="99" w:defSemiHidden="0" w:defUnhideWhenUsed="0" w:defQFormat="0" w:count="376">
     <w:lsdException w:name="Normal" w:uiPriority="0" w:qFormat="1"/>
     <w:lsdException w:name="heading 1" w:uiPriority="9" w:qFormat="1"/>
     <w:lsdException w:name="heading 2" w:semiHidden="1" w:uiPriority="9" w:unhideWhenUsed="1" w:qFormat="1"/>
@@ -1814,6 +1841,11 @@
     <w:lsdException w:name="List Table 5 Dark Accent 6" w:uiPriority="50"/>
     <w:lsdException w:name="List Table 6 Colorful Accent 6" w:uiPriority="51"/>
     <w:lsdException w:name="List Table 7 Colorful Accent 6" w:uiPriority="52"/>
+    <w:lsdException w:name="Mention" w:semiHidden="1" w:unhideWhenUsed="1"/>
+    <w:lsdException w:name="Smart Hyperlink" w:semiHidden="1" w:unhideWhenUsed="1"/>
+    <w:lsdException w:name="Hashtag" w:semiHidden="1" w:unhideWhenUsed="1"/>
+    <w:lsdException w:name="Unresolved Mention" w:semiHidden="1" w:unhideWhenUsed="1"/>
+    <w:lsdException w:name="Smart Link" w:semiHidden="1" w:unhideWhenUsed="1"/>
   </w:latentStyles>
   <w:style w:type="paragraph" w:default="1" w:styleId="Normal">
     <w:name w:val="Normal"/>
@@ -1860,7 +1892,7 @@
 </file>
 
 <file path=word/glossary/webSettings.xml><?xml version="1.0" encoding="utf-8"?>
-<w:webSettings xmlns:mc="http://schemas.openxmlformats.org/markup-compatibility/2006" xmlns:r="http://schemas.openxmlformats.org/officeDocument/2006/relationships" xmlns:w="http://schemas.openxmlformats.org/wordprocessingml/2006/main" xmlns:w14="http://schemas.microsoft.com/office/word/2010/wordml" xmlns:w15="http://schemas.microsoft.com/office/word/2012/wordml" xmlns:w16se="http://schemas.microsoft.com/office/word/2015/wordml/symex" mc:Ignorable="w14 w15 w16se">
+<w:webSettings xmlns:mc="http://schemas.openxmlformats.org/markup-compatibility/2006" xmlns:r="http://schemas.openxmlformats.org/officeDocument/2006/relationships" xmlns:w="http://schemas.openxmlformats.org/wordprocessingml/2006/main" xmlns:w14="http://schemas.microsoft.com/office/word/2010/wordml" xmlns:w15="http://schemas.microsoft.com/office/word/2012/wordml" xmlns:w16cex="http://schemas.microsoft.com/office/word/2018/wordml/cex" xmlns:w16cid="http://schemas.microsoft.com/office/word/2016/wordml/cid" xmlns:w16="http://schemas.microsoft.com/office/word/2018/wordml" xmlns:w16du="http://schemas.microsoft.com/office/word/2023/wordml/word16du" xmlns:w16sdtdh="http://schemas.microsoft.com/office/word/2020/wordml/sdtdatahash" xmlns:w16sdtfl="http://schemas.microsoft.com/office/word/2024/wordml/sdtformatlock" xmlns:w16se="http://schemas.microsoft.com/office/word/2015/wordml/symex" mc:Ignorable="w14 w15 w16se w16cid w16 w16cex w16sdtdh w16sdtfl w16du">
   <w:optimizeForBrowser/>
   <w:allowPNG/>
 </w:webSettings>
@@ -2162,6 +2194,23 @@
 </file>
 
 <file path=customXml/item1.xml><?xml version="1.0" encoding="utf-8"?>
+<p:properties xmlns:p="http://schemas.microsoft.com/office/2006/metadata/properties" xmlns:xsi="http://www.w3.org/2001/XMLSchema-instance" xmlns:pc="http://schemas.microsoft.com/office/infopath/2007/PartnerControls">
+  <documentManagement>
+    <_activity xmlns="c76fba90-bd48-4e65-9fce-772627206c4f" xsi:nil="true"/>
+  </documentManagement>
+</p:properties>
+</file>
+
+<file path=customXml/item2.xml><?xml version="1.0" encoding="utf-8"?>
+<?mso-contentType ?>
+<FormTemplates xmlns="http://schemas.microsoft.com/sharepoint/v3/contenttype/forms">
+  <Display>DocumentLibraryForm</Display>
+  <Edit>DocumentLibraryForm</Edit>
+  <New>DocumentLibraryForm</New>
+</FormTemplates>
+</file>
+
+<file path=customXml/item3.xml><?xml version="1.0" encoding="utf-8"?>
 <ct:contentTypeSchema xmlns:ct="http://schemas.microsoft.com/office/2006/metadata/contentType" xmlns:ma="http://schemas.microsoft.com/office/2006/metadata/properties/metaAttributes" ct:_="" ma:_="" ma:contentTypeName="Document" ma:contentTypeID="0x010100C0E6AB5134EB1F48BDC02E5481C039B5" ma:contentTypeVersion="11" ma:contentTypeDescription="Create a new document." ma:contentTypeScope="" ma:versionID="534b9c902e6d73dc01888420d6f564b3">
   <xsd:schema xmlns:xsd="http://www.w3.org/2001/XMLSchema" xmlns:xs="http://www.w3.org/2001/XMLSchema" xmlns:p="http://schemas.microsoft.com/office/2006/metadata/properties" xmlns:ns3="c76fba90-bd48-4e65-9fce-772627206c4f" targetNamespace="http://schemas.microsoft.com/office/2006/metadata/properties" ma:root="true" ma:fieldsID="004fb4e21aac4bf94d5df1368d873111" ns3:_="">
     <xsd:import namespace="c76fba90-bd48-4e65-9fce-772627206c4f"/>
@@ -2349,24 +2398,25 @@
 </ct:contentTypeSchema>
 </file>
 
-<file path=customXml/item2.xml><?xml version="1.0" encoding="utf-8"?>
-<?mso-contentType ?>
-<FormTemplates xmlns="http://schemas.microsoft.com/sharepoint/v3/contenttype/forms">
-  <Display>DocumentLibraryForm</Display>
-  <Edit>DocumentLibraryForm</Edit>
-  <New>DocumentLibraryForm</New>
-</FormTemplates>
+<file path=customXml/itemProps1.xml><?xml version="1.0" encoding="utf-8"?>
+<ds:datastoreItem xmlns:ds="http://schemas.openxmlformats.org/officeDocument/2006/customXml" ds:itemID="{67B89194-640F-4DC2-878A-AA227FF81D19}">
+  <ds:schemaRefs>
+    <ds:schemaRef ds:uri="http://schemas.microsoft.com/office/2006/metadata/properties"/>
+    <ds:schemaRef ds:uri="http://schemas.microsoft.com/office/infopath/2007/PartnerControls"/>
+    <ds:schemaRef ds:uri="c76fba90-bd48-4e65-9fce-772627206c4f"/>
+  </ds:schemaRefs>
+</ds:datastoreItem>
 </file>
 
-<file path=customXml/item3.xml><?xml version="1.0" encoding="utf-8"?>
-<p:properties xmlns:p="http://schemas.microsoft.com/office/2006/metadata/properties" xmlns:xsi="http://www.w3.org/2001/XMLSchema-instance" xmlns:pc="http://schemas.microsoft.com/office/infopath/2007/PartnerControls">
-  <documentManagement>
-    <_activity xmlns="c76fba90-bd48-4e65-9fce-772627206c4f" xsi:nil="true"/>
-  </documentManagement>
-</p:properties>
+<file path=customXml/itemProps2.xml><?xml version="1.0" encoding="utf-8"?>
+<ds:datastoreItem xmlns:ds="http://schemas.openxmlformats.org/officeDocument/2006/customXml" ds:itemID="{150D7E1B-4F1F-41DA-94CC-B34696FA2053}">
+  <ds:schemaRefs>
+    <ds:schemaRef ds:uri="http://schemas.microsoft.com/sharepoint/v3/contenttype/forms"/>
+  </ds:schemaRefs>
+</ds:datastoreItem>
 </file>
 
-<file path=customXml/itemProps1.xml><?xml version="1.0" encoding="utf-8"?>
+<file path=customXml/itemProps3.xml><?xml version="1.0" encoding="utf-8"?>
 <ds:datastoreItem xmlns:ds="http://schemas.openxmlformats.org/officeDocument/2006/customXml" ds:itemID="{44B3D7BC-DC27-4E40-9F94-5873E4437891}">
   <ds:schemaRefs>
     <ds:schemaRef ds:uri="http://schemas.microsoft.com/office/2006/metadata/contentType"/>
@@ -2382,22 +2432,4 @@
     <ds:schemaRef ds:uri="http://schemas.microsoft.com/internal/obd"/>
   </ds:schemaRefs>
 </ds:datastoreItem>
-</file>
-
-<file path=customXml/itemProps2.xml><?xml version="1.0" encoding="utf-8"?>
-<ds:datastoreItem xmlns:ds="http://schemas.openxmlformats.org/officeDocument/2006/customXml" ds:itemID="{150D7E1B-4F1F-41DA-94CC-B34696FA2053}">
-  <ds:schemaRefs>
-    <ds:schemaRef ds:uri="http://schemas.microsoft.com/sharepoint/v3/contenttype/forms"/>
-  </ds:schemaRefs>
-</ds:datastoreItem>
-</file>
-
-<file path=customXml/itemProps3.xml><?xml version="1.0" encoding="utf-8"?>
-<ds:datastoreItem xmlns:ds="http://schemas.openxmlformats.org/officeDocument/2006/customXml" ds:itemID="{67B89194-640F-4DC2-878A-AA227FF81D19}">
-  <ds:schemaRefs>
-    <ds:schemaRef ds:uri="http://schemas.microsoft.com/office/2006/metadata/properties"/>
-    <ds:schemaRef ds:uri="http://schemas.microsoft.com/office/infopath/2007/PartnerControls"/>
-    <ds:schemaRef ds:uri="c76fba90-bd48-4e65-9fce-772627206c4f"/>
-  </ds:schemaRefs>
-</ds:datastoreItem>
 </file>
</xml_diff>

<commit_message>
Add ASR section to select and assess which requirements materially influence architecture, data and tech stack, add AI declaration, update RTM with ASR link
</commit_message>
<xml_diff>
--- a/docs/declarations/templates/AI DECLARATION.docx
+++ b/docs/declarations/templates/AI DECLARATION.docx
@@ -1,6 +1,6 @@
 
 <file path=word/document.xml><?xml version="1.0" encoding="utf-8"?>
-<w:document xmlns:wpc="http://schemas.microsoft.com/office/word/2010/wordprocessingCanvas" xmlns:cx="http://schemas.microsoft.com/office/drawing/2014/chartex" xmlns:mc="http://schemas.openxmlformats.org/markup-compatibility/2006" xmlns:o="urn:schemas-microsoft-com:office:office" xmlns:r="http://schemas.openxmlformats.org/officeDocument/2006/relationships" xmlns:m="http://schemas.openxmlformats.org/officeDocument/2006/math" xmlns:v="urn:schemas-microsoft-com:vml" xmlns:wp14="http://schemas.microsoft.com/office/word/2010/wordprocessingDrawing" xmlns:wp="http://schemas.openxmlformats.org/drawingml/2006/wordprocessingDrawing" xmlns:w10="urn:schemas-microsoft-com:office:word" xmlns:w="http://schemas.openxmlformats.org/wordprocessingml/2006/main" xmlns:w14="http://schemas.microsoft.com/office/word/2010/wordml" xmlns:w15="http://schemas.microsoft.com/office/word/2012/wordml" xmlns:w16se="http://schemas.microsoft.com/office/word/2015/wordml/symex" xmlns:wpg="http://schemas.microsoft.com/office/word/2010/wordprocessingGroup" xmlns:wpi="http://schemas.microsoft.com/office/word/2010/wordprocessingInk" xmlns:wne="http://schemas.microsoft.com/office/word/2006/wordml" xmlns:wps="http://schemas.microsoft.com/office/word/2010/wordprocessingShape" mc:Ignorable="w14 w15 w16se wp14">
+<w:document xmlns:wpc="http://schemas.microsoft.com/office/word/2010/wordprocessingCanvas" xmlns:cx="http://schemas.microsoft.com/office/drawing/2014/chartex" xmlns:cx1="http://schemas.microsoft.com/office/drawing/2015/9/8/chartex" xmlns:cx2="http://schemas.microsoft.com/office/drawing/2015/10/21/chartex" xmlns:cx3="http://schemas.microsoft.com/office/drawing/2016/5/9/chartex" xmlns:cx4="http://schemas.microsoft.com/office/drawing/2016/5/10/chartex" xmlns:cx5="http://schemas.microsoft.com/office/drawing/2016/5/11/chartex" xmlns:cx6="http://schemas.microsoft.com/office/drawing/2016/5/12/chartex" xmlns:cx7="http://schemas.microsoft.com/office/drawing/2016/5/13/chartex" xmlns:cx8="http://schemas.microsoft.com/office/drawing/2016/5/14/chartex" xmlns:mc="http://schemas.openxmlformats.org/markup-compatibility/2006" xmlns:aink="http://schemas.microsoft.com/office/drawing/2016/ink" xmlns:am3d="http://schemas.microsoft.com/office/drawing/2017/model3d" xmlns:o="urn:schemas-microsoft-com:office:office" xmlns:oel="http://schemas.microsoft.com/office/2019/extlst" xmlns:r="http://schemas.openxmlformats.org/officeDocument/2006/relationships" xmlns:m="http://schemas.openxmlformats.org/officeDocument/2006/math" xmlns:v="urn:schemas-microsoft-com:vml" xmlns:wp14="http://schemas.microsoft.com/office/word/2010/wordprocessingDrawing" xmlns:wp="http://schemas.openxmlformats.org/drawingml/2006/wordprocessingDrawing" xmlns:w10="urn:schemas-microsoft-com:office:word" xmlns:w="http://schemas.openxmlformats.org/wordprocessingml/2006/main" xmlns:w14="http://schemas.microsoft.com/office/word/2010/wordml" xmlns:w15="http://schemas.microsoft.com/office/word/2012/wordml" xmlns:w16cex="http://schemas.microsoft.com/office/word/2018/wordml/cex" xmlns:w16cid="http://schemas.microsoft.com/office/word/2016/wordml/cid" xmlns:w16="http://schemas.microsoft.com/office/word/2018/wordml" xmlns:w16du="http://schemas.microsoft.com/office/word/2023/wordml/word16du" xmlns:w16sdtdh="http://schemas.microsoft.com/office/word/2020/wordml/sdtdatahash" xmlns:w16sdtfl="http://schemas.microsoft.com/office/word/2024/wordml/sdtformatlock" xmlns:w16se="http://schemas.microsoft.com/office/word/2015/wordml/symex" xmlns:wpg="http://schemas.microsoft.com/office/word/2010/wordprocessingGroup" xmlns:wpi="http://schemas.microsoft.com/office/word/2010/wordprocessingInk" xmlns:wne="http://schemas.microsoft.com/office/word/2006/wordml" xmlns:wps="http://schemas.microsoft.com/office/word/2010/wordprocessingShape" mc:Ignorable="w14 w15 w16se w16cid w16 w16cex w16sdtdh w16sdtfl w16du wp14">
   <w:body>
     <w:p>
       <w:pPr>
@@ -33,15 +33,7 @@
         <w:t xml:space="preserve"> </w:t>
       </w:r>
       <w:r>
-        <w:t xml:space="preserve">SEN381 </w:t>
-      </w:r>
-      <w:proofErr w:type="spellStart"/>
-      <w:r>
-        <w:t>CivicConnect</w:t>
-      </w:r>
-      <w:proofErr w:type="spellEnd"/>
-      <w:r>
-        <w:t xml:space="preserve"> Project</w:t>
+        <w:t>SEN381 CivicConnect Project</w:t>
       </w:r>
     </w:p>
     <w:p>
@@ -65,10 +57,18 @@
             <w:docPart w:val="DefaultPlaceholder_-1854013440"/>
           </w:placeholder>
         </w:sdtPr>
-        <w:sdtEndPr/>
         <w:sdtContent>
           <w:r>
             <w:t>docs/</w:t>
+          </w:r>
+          <w:r>
+            <w:t>m2-</w:t>
+          </w:r>
+          <w:r>
+            <w:t>asrs</w:t>
+          </w:r>
+          <w:r>
+            <w:t>-2.0</w:t>
           </w:r>
         </w:sdtContent>
       </w:sdt>
@@ -76,15 +76,22 @@
     <w:p>
       <w:pPr>
         <w:spacing w:line="360" w:lineRule="auto"/>
+        <w:rPr>
+          <w:lang w:val="nl-NL"/>
+        </w:rPr>
       </w:pPr>
       <w:r>
         <w:rPr>
           <w:b/>
           <w:bCs/>
+          <w:lang w:val="nl-NL"/>
         </w:rPr>
         <w:t>Student Name:</w:t>
       </w:r>
       <w:r>
+        <w:rPr>
+          <w:lang w:val="nl-NL"/>
+        </w:rPr>
         <w:t xml:space="preserve"> </w:t>
       </w:r>
       <w:sdt>
@@ -94,10 +101,12 @@
             <w:docPart w:val="DefaultPlaceholder_-1854013440"/>
           </w:placeholder>
         </w:sdtPr>
-        <w:sdtEndPr/>
         <w:sdtContent>
           <w:r>
-            <w:t>Jimmy Junior Baloyi</w:t>
+            <w:rPr>
+              <w:lang w:val="nl-NL"/>
+            </w:rPr>
+            <w:t>Karabo Masoka</w:t>
           </w:r>
         </w:sdtContent>
       </w:sdt>
@@ -105,15 +114,22 @@
     <w:p>
       <w:pPr>
         <w:spacing w:line="360" w:lineRule="auto"/>
+        <w:rPr>
+          <w:lang w:val="nl-NL"/>
+        </w:rPr>
       </w:pPr>
       <w:r>
         <w:rPr>
           <w:b/>
           <w:bCs/>
+          <w:lang w:val="nl-NL"/>
         </w:rPr>
         <w:t>Student Number:</w:t>
       </w:r>
       <w:r>
+        <w:rPr>
+          <w:lang w:val="nl-NL"/>
+        </w:rPr>
         <w:t xml:space="preserve"> </w:t>
       </w:r>
       <w:sdt>
@@ -123,10 +139,18 @@
             <w:docPart w:val="DefaultPlaceholder_-1854013440"/>
           </w:placeholder>
         </w:sdtPr>
-        <w:sdtEndPr/>
         <w:sdtContent>
           <w:r>
-            <w:t>601713</w:t>
+            <w:rPr>
+              <w:lang w:val="nl-NL"/>
+            </w:rPr>
+            <w:t>6</w:t>
+          </w:r>
+          <w:r>
+            <w:rPr>
+              <w:lang w:val="nl-NL"/>
+            </w:rPr>
+            <w:t>01644</w:t>
           </w:r>
         </w:sdtContent>
       </w:sdt>
@@ -181,14 +205,20 @@
             <w:docPart w:val="DefaultPlaceholder_-1854013440"/>
           </w:placeholder>
         </w:sdtPr>
-        <w:sdtEndPr/>
         <w:sdtContent>
           <w:r>
             <w:rPr>
               <w:b/>
               <w:bCs/>
             </w:rPr>
-            <w:t>03</w:t>
+            <w:t>0</w:t>
+          </w:r>
+          <w:r>
+            <w:rPr>
+              <w:b/>
+              <w:bCs/>
+            </w:rPr>
+            <w:t>6</w:t>
           </w:r>
         </w:sdtContent>
       </w:sdt>
@@ -234,7 +264,6 @@
             <w14:uncheckedState w14:val="2610" w14:font="MS Gothic"/>
           </w14:checkbox>
         </w:sdtPr>
-        <w:sdtEndPr/>
         <w:sdtContent>
           <w:r>
             <w:rPr>
@@ -295,10 +324,9 @@
             <w:docPart w:val="DefaultPlaceholder_-1854013440"/>
           </w:placeholder>
         </w:sdtPr>
-        <w:sdtEndPr/>
         <w:sdtContent>
           <w:r>
-            <w:t>Jimmy Junior Baloyi</w:t>
+            <w:t>Karabo Masoka</w:t>
           </w:r>
         </w:sdtContent>
       </w:sdt>
@@ -323,17 +351,19 @@
           <w:placeholder>
             <w:docPart w:val="DefaultPlaceholder_-1854013437"/>
           </w:placeholder>
-          <w:date w:fullDate="2026-09-09T00:00:00Z">
+          <w:date w:fullDate="2026-09-29T00:00:00Z">
             <w:dateFormat w:val="yyyy/MM/dd"/>
             <w:lid w:val="en-ZA"/>
             <w:storeMappedDataAs w:val="dateTime"/>
             <w:calendar w:val="gregorian"/>
           </w:date>
         </w:sdtPr>
-        <w:sdtEndPr/>
         <w:sdtContent>
           <w:r>
-            <w:t>2026/09/09</w:t>
+            <w:t>2026/09/</w:t>
+          </w:r>
+          <w:r>
+            <w:t>29</w:t>
           </w:r>
         </w:sdtContent>
       </w:sdt>
@@ -349,7 +379,7 @@
 </file>
 
 <file path=word/styles.xml><?xml version="1.0" encoding="utf-8"?>
-<w:styles xmlns:mc="http://schemas.openxmlformats.org/markup-compatibility/2006" xmlns:r="http://schemas.openxmlformats.org/officeDocument/2006/relationships" xmlns:w="http://schemas.openxmlformats.org/wordprocessingml/2006/main" xmlns:w14="http://schemas.microsoft.com/office/word/2010/wordml" xmlns:w15="http://schemas.microsoft.com/office/word/2012/wordml" xmlns:w16se="http://schemas.microsoft.com/office/word/2015/wordml/symex" mc:Ignorable="w14 w15 w16se">
+<w:styles xmlns:mc="http://schemas.openxmlformats.org/markup-compatibility/2006" xmlns:r="http://schemas.openxmlformats.org/officeDocument/2006/relationships" xmlns:w="http://schemas.openxmlformats.org/wordprocessingml/2006/main" xmlns:w14="http://schemas.microsoft.com/office/word/2010/wordml" xmlns:w15="http://schemas.microsoft.com/office/word/2012/wordml" xmlns:w16cex="http://schemas.microsoft.com/office/word/2018/wordml/cex" xmlns:w16cid="http://schemas.microsoft.com/office/word/2016/wordml/cid" xmlns:w16="http://schemas.microsoft.com/office/word/2018/wordml" xmlns:w16du="http://schemas.microsoft.com/office/word/2023/wordml/word16du" xmlns:w16sdtdh="http://schemas.microsoft.com/office/word/2020/wordml/sdtdatahash" xmlns:w16sdtfl="http://schemas.microsoft.com/office/word/2024/wordml/sdtformatlock" xmlns:w16se="http://schemas.microsoft.com/office/word/2015/wordml/symex" mc:Ignorable="w14 w15 w16se w16cid w16 w16cex w16sdtdh w16sdtfl w16du">
   <w:docDefaults>
     <w:rPrDefault>
       <w:rPr>
@@ -367,7 +397,7 @@
       </w:pPr>
     </w:pPrDefault>
   </w:docDefaults>
-  <w:latentStyles w:defLockedState="0" w:defUIPriority="99" w:defSemiHidden="0" w:defUnhideWhenUsed="0" w:defQFormat="0" w:count="371">
+  <w:latentStyles w:defLockedState="0" w:defUIPriority="99" w:defSemiHidden="0" w:defUnhideWhenUsed="0" w:defQFormat="0" w:count="376">
     <w:lsdException w:name="Normal" w:uiPriority="0" w:qFormat="1"/>
     <w:lsdException w:name="heading 1" w:uiPriority="9" w:qFormat="1"/>
     <w:lsdException w:name="heading 2" w:semiHidden="1" w:uiPriority="9" w:unhideWhenUsed="1" w:qFormat="1"/>
@@ -739,6 +769,11 @@
     <w:lsdException w:name="List Table 5 Dark Accent 6" w:uiPriority="50"/>
     <w:lsdException w:name="List Table 6 Colorful Accent 6" w:uiPriority="51"/>
     <w:lsdException w:name="List Table 7 Colorful Accent 6" w:uiPriority="52"/>
+    <w:lsdException w:name="Mention" w:semiHidden="1" w:unhideWhenUsed="1"/>
+    <w:lsdException w:name="Smart Hyperlink" w:semiHidden="1" w:unhideWhenUsed="1"/>
+    <w:lsdException w:name="Hashtag" w:semiHidden="1" w:unhideWhenUsed="1"/>
+    <w:lsdException w:name="Unresolved Mention" w:semiHidden="1" w:unhideWhenUsed="1"/>
+    <w:lsdException w:name="Smart Link" w:semiHidden="1" w:unhideWhenUsed="1"/>
   </w:latentStyles>
   <w:style w:type="paragraph" w:default="1" w:styleId="Normal">
     <w:name w:val="Normal"/>
@@ -1274,7 +1309,7 @@
 </file>
 
 <file path=word/glossary/document.xml><?xml version="1.0" encoding="utf-8"?>
-<w:glossaryDocument xmlns:wpc="http://schemas.microsoft.com/office/word/2010/wordprocessingCanvas" xmlns:cx="http://schemas.microsoft.com/office/drawing/2014/chartex" xmlns:mc="http://schemas.openxmlformats.org/markup-compatibility/2006" xmlns:o="urn:schemas-microsoft-com:office:office" xmlns:r="http://schemas.openxmlformats.org/officeDocument/2006/relationships" xmlns:m="http://schemas.openxmlformats.org/officeDocument/2006/math" xmlns:v="urn:schemas-microsoft-com:vml" xmlns:wp14="http://schemas.microsoft.com/office/word/2010/wordprocessingDrawing" xmlns:wp="http://schemas.openxmlformats.org/drawingml/2006/wordprocessingDrawing" xmlns:w10="urn:schemas-microsoft-com:office:word" xmlns:w="http://schemas.openxmlformats.org/wordprocessingml/2006/main" xmlns:w14="http://schemas.microsoft.com/office/word/2010/wordml" xmlns:w15="http://schemas.microsoft.com/office/word/2012/wordml" xmlns:w16se="http://schemas.microsoft.com/office/word/2015/wordml/symex" xmlns:wpg="http://schemas.microsoft.com/office/word/2010/wordprocessingGroup" xmlns:wpi="http://schemas.microsoft.com/office/word/2010/wordprocessingInk" xmlns:wne="http://schemas.microsoft.com/office/word/2006/wordml" xmlns:wps="http://schemas.microsoft.com/office/word/2010/wordprocessingShape" mc:Ignorable="w14 w15 w16se wp14">
+<w:glossaryDocument xmlns:wpc="http://schemas.microsoft.com/office/word/2010/wordprocessingCanvas" xmlns:cx="http://schemas.microsoft.com/office/drawing/2014/chartex" xmlns:cx1="http://schemas.microsoft.com/office/drawing/2015/9/8/chartex" xmlns:cx2="http://schemas.microsoft.com/office/drawing/2015/10/21/chartex" xmlns:cx3="http://schemas.microsoft.com/office/drawing/2016/5/9/chartex" xmlns:cx4="http://schemas.microsoft.com/office/drawing/2016/5/10/chartex" xmlns:cx5="http://schemas.microsoft.com/office/drawing/2016/5/11/chartex" xmlns:cx6="http://schemas.microsoft.com/office/drawing/2016/5/12/chartex" xmlns:cx7="http://schemas.microsoft.com/office/drawing/2016/5/13/chartex" xmlns:cx8="http://schemas.microsoft.com/office/drawing/2016/5/14/chartex" xmlns:mc="http://schemas.openxmlformats.org/markup-compatibility/2006" xmlns:aink="http://schemas.microsoft.com/office/drawing/2016/ink" xmlns:am3d="http://schemas.microsoft.com/office/drawing/2017/model3d" xmlns:o="urn:schemas-microsoft-com:office:office" xmlns:oel="http://schemas.microsoft.com/office/2019/extlst" xmlns:r="http://schemas.openxmlformats.org/officeDocument/2006/relationships" xmlns:m="http://schemas.openxmlformats.org/officeDocument/2006/math" xmlns:v="urn:schemas-microsoft-com:vml" xmlns:wp14="http://schemas.microsoft.com/office/word/2010/wordprocessingDrawing" xmlns:wp="http://schemas.openxmlformats.org/drawingml/2006/wordprocessingDrawing" xmlns:w10="urn:schemas-microsoft-com:office:word" xmlns:w="http://schemas.openxmlformats.org/wordprocessingml/2006/main" xmlns:w14="http://schemas.microsoft.com/office/word/2010/wordml" xmlns:w15="http://schemas.microsoft.com/office/word/2012/wordml" xmlns:w16cex="http://schemas.microsoft.com/office/word/2018/wordml/cex" xmlns:w16cid="http://schemas.microsoft.com/office/word/2016/wordml/cid" xmlns:w16="http://schemas.microsoft.com/office/word/2018/wordml" xmlns:w16du="http://schemas.microsoft.com/office/word/2023/wordml/word16du" xmlns:w16sdtdh="http://schemas.microsoft.com/office/word/2020/wordml/sdtdatahash" xmlns:w16sdtfl="http://schemas.microsoft.com/office/word/2024/wordml/sdtformatlock" xmlns:w16se="http://schemas.microsoft.com/office/word/2015/wordml/symex" xmlns:wpg="http://schemas.microsoft.com/office/word/2010/wordprocessingGroup" xmlns:wpi="http://schemas.microsoft.com/office/word/2010/wordprocessingInk" xmlns:wne="http://schemas.microsoft.com/office/word/2006/wordml" xmlns:wps="http://schemas.microsoft.com/office/word/2010/wordprocessingShape" mc:Ignorable="w14 w15 w16se w16cid w16 w16cex w16sdtdh w16sdtfl w16du wp14">
   <w:docParts>
     <w:docPart>
       <w:docPartPr>
@@ -1333,13 +1368,12 @@
 </file>
 
 <file path=word/glossary/fontTable.xml><?xml version="1.0" encoding="utf-8"?>
-<w:fonts xmlns:mc="http://schemas.openxmlformats.org/markup-compatibility/2006" xmlns:r="http://schemas.openxmlformats.org/officeDocument/2006/relationships" xmlns:w="http://schemas.openxmlformats.org/wordprocessingml/2006/main" xmlns:w14="http://schemas.microsoft.com/office/word/2010/wordml" xmlns:w15="http://schemas.microsoft.com/office/word/2012/wordml" xmlns:w16se="http://schemas.microsoft.com/office/word/2015/wordml/symex" mc:Ignorable="w14 w15 w16se">
+<w:fonts xmlns:mc="http://schemas.openxmlformats.org/markup-compatibility/2006" xmlns:r="http://schemas.openxmlformats.org/officeDocument/2006/relationships" xmlns:w="http://schemas.openxmlformats.org/wordprocessingml/2006/main" xmlns:w14="http://schemas.microsoft.com/office/word/2010/wordml" xmlns:w15="http://schemas.microsoft.com/office/word/2012/wordml" xmlns:w16cex="http://schemas.microsoft.com/office/word/2018/wordml/cex" xmlns:w16cid="http://schemas.microsoft.com/office/word/2016/wordml/cid" xmlns:w16="http://schemas.microsoft.com/office/word/2018/wordml" xmlns:w16du="http://schemas.microsoft.com/office/word/2023/wordml/word16du" xmlns:w16sdtdh="http://schemas.microsoft.com/office/word/2020/wordml/sdtdatahash" xmlns:w16sdtfl="http://schemas.microsoft.com/office/word/2024/wordml/sdtformatlock" xmlns:w16se="http://schemas.microsoft.com/office/word/2015/wordml/symex" mc:Ignorable="w14 w15 w16se w16cid w16 w16cex w16sdtdh w16sdtfl w16du">
   <w:font w:name="Aptos">
-    <w:altName w:val="Arial"/>
     <w:charset w:val="00"/>
     <w:family w:val="swiss"/>
     <w:pitch w:val="variable"/>
-    <w:sig w:usb0="00000001" w:usb1="00000003" w:usb2="00000000" w:usb3="00000000" w:csb0="0000019F" w:csb1="00000000"/>
+    <w:sig w:usb0="20000287" w:usb1="00000003" w:usb2="00000000" w:usb3="00000000" w:csb0="0000019F" w:csb1="00000000"/>
   </w:font>
   <w:font w:name="Times New Roman">
     <w:panose1 w:val="02020603050405020304"/>
@@ -1349,11 +1383,10 @@
     <w:sig w:usb0="E0002EFF" w:usb1="C000785B" w:usb2="00000009" w:usb3="00000000" w:csb0="000001FF" w:csb1="00000000"/>
   </w:font>
   <w:font w:name="Aptos Display">
-    <w:altName w:val="Arial"/>
     <w:charset w:val="00"/>
     <w:family w:val="swiss"/>
     <w:pitch w:val="variable"/>
-    <w:sig w:usb0="00000001" w:usb1="00000003" w:usb2="00000000" w:usb3="00000000" w:csb0="0000019F" w:csb1="00000000"/>
+    <w:sig w:usb0="20000287" w:usb1="00000003" w:usb2="00000000" w:usb3="00000000" w:csb0="0000019F" w:csb1="00000000"/>
   </w:font>
   <w:font w:name="MS Gothic">
     <w:altName w:val="ＭＳ ゴシック"/>
@@ -1363,25 +1396,11 @@
     <w:pitch w:val="fixed"/>
     <w:sig w:usb0="E00002FF" w:usb1="6AC7FDFB" w:usb2="08000012" w:usb3="00000000" w:csb0="0002009F" w:csb1="00000000"/>
   </w:font>
-  <w:font w:name="Calibri">
-    <w:panose1 w:val="020F0502020204030204"/>
-    <w:charset w:val="00"/>
-    <w:family w:val="swiss"/>
-    <w:pitch w:val="variable"/>
-    <w:sig w:usb0="E4002EFF" w:usb1="C200247B" w:usb2="00000009" w:usb3="00000000" w:csb0="000001FF" w:csb1="00000000"/>
-  </w:font>
-  <w:font w:name="Calibri Light">
-    <w:panose1 w:val="020F0302020204030204"/>
-    <w:charset w:val="00"/>
-    <w:family w:val="swiss"/>
-    <w:pitch w:val="variable"/>
-    <w:sig w:usb0="E4002EFF" w:usb1="C200247B" w:usb2="00000009" w:usb3="00000000" w:csb0="000001FF" w:csb1="00000000"/>
-  </w:font>
 </w:fonts>
 </file>
 
 <file path=word/glossary/settings.xml><?xml version="1.0" encoding="utf-8"?>
-<w:settings xmlns:mc="http://schemas.openxmlformats.org/markup-compatibility/2006" xmlns:o="urn:schemas-microsoft-com:office:office" xmlns:r="http://schemas.openxmlformats.org/officeDocument/2006/relationships" xmlns:m="http://schemas.openxmlformats.org/officeDocument/2006/math" xmlns:v="urn:schemas-microsoft-com:vml" xmlns:w10="urn:schemas-microsoft-com:office:word" xmlns:w="http://schemas.openxmlformats.org/wordprocessingml/2006/main" xmlns:w14="http://schemas.microsoft.com/office/word/2010/wordml" xmlns:w15="http://schemas.microsoft.com/office/word/2012/wordml" xmlns:w16se="http://schemas.microsoft.com/office/word/2015/wordml/symex" xmlns:sl="http://schemas.openxmlformats.org/schemaLibrary/2006/main" mc:Ignorable="w14 w15 w16se">
+<w:settings xmlns:mc="http://schemas.openxmlformats.org/markup-compatibility/2006" xmlns:o="urn:schemas-microsoft-com:office:office" xmlns:r="http://schemas.openxmlformats.org/officeDocument/2006/relationships" xmlns:m="http://schemas.openxmlformats.org/officeDocument/2006/math" xmlns:v="urn:schemas-microsoft-com:vml" xmlns:w10="urn:schemas-microsoft-com:office:word" xmlns:w="http://schemas.openxmlformats.org/wordprocessingml/2006/main" xmlns:w14="http://schemas.microsoft.com/office/word/2010/wordml" xmlns:w15="http://schemas.microsoft.com/office/word/2012/wordml" xmlns:w16cex="http://schemas.microsoft.com/office/word/2018/wordml/cex" xmlns:w16cid="http://schemas.microsoft.com/office/word/2016/wordml/cid" xmlns:w16="http://schemas.microsoft.com/office/word/2018/wordml" xmlns:w16du="http://schemas.microsoft.com/office/word/2023/wordml/word16du" xmlns:w16sdtdh="http://schemas.microsoft.com/office/word/2020/wordml/sdtdatahash" xmlns:w16sdtfl="http://schemas.microsoft.com/office/word/2024/wordml/sdtformatlock" xmlns:w16se="http://schemas.microsoft.com/office/word/2015/wordml/symex" xmlns:sl="http://schemas.openxmlformats.org/schemaLibrary/2006/main" mc:Ignorable="w14 w15 w16se w16cid w16 w16cex w16sdtdh w16sdtfl w16du">
   <w:view w:val="normal"/>
   <w:defaultTabStop w:val="720"/>
   <w:characterSpacingControl w:val="doNotCompress"/>
@@ -1392,15 +1411,18 @@
     <w:compatSetting w:name="enableOpenTypeFeatures" w:uri="http://schemas.microsoft.com/office/word" w:val="1"/>
     <w:compatSetting w:name="doNotFlipMirrorIndents" w:uri="http://schemas.microsoft.com/office/word" w:val="1"/>
     <w:compatSetting w:name="differentiateMultirowTableHeaders" w:uri="http://schemas.microsoft.com/office/word" w:val="1"/>
+    <w:compatSetting w:name="useWord2013TrackBottomHyphenation" w:uri="http://schemas.microsoft.com/office/word" w:val="1"/>
   </w:compat>
   <w:rsids>
     <w:rsidRoot w:val="006573DA"/>
     <w:rsid w:val="003D50F4"/>
     <w:rsid w:val="006573DA"/>
+    <w:rsid w:val="00B823D9"/>
     <w:rsid w:val="00B958DB"/>
     <w:rsid w:val="00CD62E1"/>
     <w:rsid w:val="00E063BC"/>
     <w:rsid w:val="00F509BB"/>
+    <w:rsid w:val="00FF0D6A"/>
   </w:rsids>
   <m:mathPr>
     <m:mathFont m:val="Cambria Math"/>
@@ -1424,7 +1446,7 @@
 </file>
 
 <file path=word/glossary/styles.xml><?xml version="1.0" encoding="utf-8"?>
-<w:styles xmlns:mc="http://schemas.openxmlformats.org/markup-compatibility/2006" xmlns:r="http://schemas.openxmlformats.org/officeDocument/2006/relationships" xmlns:w="http://schemas.openxmlformats.org/wordprocessingml/2006/main" xmlns:w14="http://schemas.microsoft.com/office/word/2010/wordml" xmlns:w15="http://schemas.microsoft.com/office/word/2012/wordml" xmlns:w16se="http://schemas.microsoft.com/office/word/2015/wordml/symex" mc:Ignorable="w14 w15 w16se">
+<w:styles xmlns:mc="http://schemas.openxmlformats.org/markup-compatibility/2006" xmlns:r="http://schemas.openxmlformats.org/officeDocument/2006/relationships" xmlns:w="http://schemas.openxmlformats.org/wordprocessingml/2006/main" xmlns:w14="http://schemas.microsoft.com/office/word/2010/wordml" xmlns:w15="http://schemas.microsoft.com/office/word/2012/wordml" xmlns:w16cex="http://schemas.microsoft.com/office/word/2018/wordml/cex" xmlns:w16cid="http://schemas.microsoft.com/office/word/2016/wordml/cid" xmlns:w16="http://schemas.microsoft.com/office/word/2018/wordml" xmlns:w16du="http://schemas.microsoft.com/office/word/2023/wordml/word16du" xmlns:w16sdtdh="http://schemas.microsoft.com/office/word/2020/wordml/sdtdatahash" xmlns:w16sdtfl="http://schemas.microsoft.com/office/word/2024/wordml/sdtformatlock" xmlns:w16se="http://schemas.microsoft.com/office/word/2015/wordml/symex" mc:Ignorable="w14 w15 w16se w16cid w16 w16cex w16sdtdh w16sdtfl w16du">
   <w:docDefaults>
     <w:rPrDefault>
       <w:rPr>
@@ -1442,7 +1464,7 @@
       </w:pPr>
     </w:pPrDefault>
   </w:docDefaults>
-  <w:latentStyles w:defLockedState="0" w:defUIPriority="99" w:defSemiHidden="0" w:defUnhideWhenUsed="0" w:defQFormat="0" w:count="371">
+  <w:latentStyles w:defLockedState="0" w:defUIPriority="99" w:defSemiHidden="0" w:defUnhideWhenUsed="0" w:defQFormat="0" w:count="376">
     <w:lsdException w:name="Normal" w:uiPriority="0" w:qFormat="1"/>
     <w:lsdException w:name="heading 1" w:uiPriority="9" w:qFormat="1"/>
     <w:lsdException w:name="heading 2" w:semiHidden="1" w:uiPriority="9" w:unhideWhenUsed="1" w:qFormat="1"/>
@@ -1814,6 +1836,11 @@
     <w:lsdException w:name="List Table 5 Dark Accent 6" w:uiPriority="50"/>
     <w:lsdException w:name="List Table 6 Colorful Accent 6" w:uiPriority="51"/>
     <w:lsdException w:name="List Table 7 Colorful Accent 6" w:uiPriority="52"/>
+    <w:lsdException w:name="Mention" w:semiHidden="1" w:unhideWhenUsed="1"/>
+    <w:lsdException w:name="Smart Hyperlink" w:semiHidden="1" w:unhideWhenUsed="1"/>
+    <w:lsdException w:name="Hashtag" w:semiHidden="1" w:unhideWhenUsed="1"/>
+    <w:lsdException w:name="Unresolved Mention" w:semiHidden="1" w:unhideWhenUsed="1"/>
+    <w:lsdException w:name="Smart Link" w:semiHidden="1" w:unhideWhenUsed="1"/>
   </w:latentStyles>
   <w:style w:type="paragraph" w:default="1" w:styleId="Normal">
     <w:name w:val="Normal"/>
@@ -1860,7 +1887,7 @@
 </file>
 
 <file path=word/glossary/webSettings.xml><?xml version="1.0" encoding="utf-8"?>
-<w:webSettings xmlns:mc="http://schemas.openxmlformats.org/markup-compatibility/2006" xmlns:r="http://schemas.openxmlformats.org/officeDocument/2006/relationships" xmlns:w="http://schemas.openxmlformats.org/wordprocessingml/2006/main" xmlns:w14="http://schemas.microsoft.com/office/word/2010/wordml" xmlns:w15="http://schemas.microsoft.com/office/word/2012/wordml" xmlns:w16se="http://schemas.microsoft.com/office/word/2015/wordml/symex" mc:Ignorable="w14 w15 w16se">
+<w:webSettings xmlns:mc="http://schemas.openxmlformats.org/markup-compatibility/2006" xmlns:r="http://schemas.openxmlformats.org/officeDocument/2006/relationships" xmlns:w="http://schemas.openxmlformats.org/wordprocessingml/2006/main" xmlns:w14="http://schemas.microsoft.com/office/word/2010/wordml" xmlns:w15="http://schemas.microsoft.com/office/word/2012/wordml" xmlns:w16cex="http://schemas.microsoft.com/office/word/2018/wordml/cex" xmlns:w16cid="http://schemas.microsoft.com/office/word/2016/wordml/cid" xmlns:w16="http://schemas.microsoft.com/office/word/2018/wordml" xmlns:w16du="http://schemas.microsoft.com/office/word/2023/wordml/word16du" xmlns:w16sdtdh="http://schemas.microsoft.com/office/word/2020/wordml/sdtdatahash" xmlns:w16sdtfl="http://schemas.microsoft.com/office/word/2024/wordml/sdtformatlock" xmlns:w16se="http://schemas.microsoft.com/office/word/2015/wordml/symex" mc:Ignorable="w14 w15 w16se w16cid w16 w16cex w16sdtdh w16sdtfl w16du">
   <w:optimizeForBrowser/>
   <w:allowPNG/>
 </w:webSettings>
@@ -2162,6 +2189,23 @@
 </file>
 
 <file path=customXml/item1.xml><?xml version="1.0" encoding="utf-8"?>
+<p:properties xmlns:p="http://schemas.microsoft.com/office/2006/metadata/properties" xmlns:xsi="http://www.w3.org/2001/XMLSchema-instance" xmlns:pc="http://schemas.microsoft.com/office/infopath/2007/PartnerControls">
+  <documentManagement>
+    <_activity xmlns="c76fba90-bd48-4e65-9fce-772627206c4f" xsi:nil="true"/>
+  </documentManagement>
+</p:properties>
+</file>
+
+<file path=customXml/item2.xml><?xml version="1.0" encoding="utf-8"?>
+<?mso-contentType ?>
+<FormTemplates xmlns="http://schemas.microsoft.com/sharepoint/v3/contenttype/forms">
+  <Display>DocumentLibraryForm</Display>
+  <Edit>DocumentLibraryForm</Edit>
+  <New>DocumentLibraryForm</New>
+</FormTemplates>
+</file>
+
+<file path=customXml/item3.xml><?xml version="1.0" encoding="utf-8"?>
 <ct:contentTypeSchema xmlns:ct="http://schemas.microsoft.com/office/2006/metadata/contentType" xmlns:ma="http://schemas.microsoft.com/office/2006/metadata/properties/metaAttributes" ct:_="" ma:_="" ma:contentTypeName="Document" ma:contentTypeID="0x010100C0E6AB5134EB1F48BDC02E5481C039B5" ma:contentTypeVersion="11" ma:contentTypeDescription="Create a new document." ma:contentTypeScope="" ma:versionID="534b9c902e6d73dc01888420d6f564b3">
   <xsd:schema xmlns:xsd="http://www.w3.org/2001/XMLSchema" xmlns:xs="http://www.w3.org/2001/XMLSchema" xmlns:p="http://schemas.microsoft.com/office/2006/metadata/properties" xmlns:ns3="c76fba90-bd48-4e65-9fce-772627206c4f" targetNamespace="http://schemas.microsoft.com/office/2006/metadata/properties" ma:root="true" ma:fieldsID="004fb4e21aac4bf94d5df1368d873111" ns3:_="">
     <xsd:import namespace="c76fba90-bd48-4e65-9fce-772627206c4f"/>
@@ -2349,24 +2393,25 @@
 </ct:contentTypeSchema>
 </file>
 
-<file path=customXml/item2.xml><?xml version="1.0" encoding="utf-8"?>
-<?mso-contentType ?>
-<FormTemplates xmlns="http://schemas.microsoft.com/sharepoint/v3/contenttype/forms">
-  <Display>DocumentLibraryForm</Display>
-  <Edit>DocumentLibraryForm</Edit>
-  <New>DocumentLibraryForm</New>
-</FormTemplates>
+<file path=customXml/itemProps1.xml><?xml version="1.0" encoding="utf-8"?>
+<ds:datastoreItem xmlns:ds="http://schemas.openxmlformats.org/officeDocument/2006/customXml" ds:itemID="{67B89194-640F-4DC2-878A-AA227FF81D19}">
+  <ds:schemaRefs>
+    <ds:schemaRef ds:uri="http://schemas.microsoft.com/office/2006/metadata/properties"/>
+    <ds:schemaRef ds:uri="http://schemas.microsoft.com/office/infopath/2007/PartnerControls"/>
+    <ds:schemaRef ds:uri="c76fba90-bd48-4e65-9fce-772627206c4f"/>
+  </ds:schemaRefs>
+</ds:datastoreItem>
 </file>
 
-<file path=customXml/item3.xml><?xml version="1.0" encoding="utf-8"?>
-<p:properties xmlns:p="http://schemas.microsoft.com/office/2006/metadata/properties" xmlns:xsi="http://www.w3.org/2001/XMLSchema-instance" xmlns:pc="http://schemas.microsoft.com/office/infopath/2007/PartnerControls">
-  <documentManagement>
-    <_activity xmlns="c76fba90-bd48-4e65-9fce-772627206c4f" xsi:nil="true"/>
-  </documentManagement>
-</p:properties>
+<file path=customXml/itemProps2.xml><?xml version="1.0" encoding="utf-8"?>
+<ds:datastoreItem xmlns:ds="http://schemas.openxmlformats.org/officeDocument/2006/customXml" ds:itemID="{150D7E1B-4F1F-41DA-94CC-B34696FA2053}">
+  <ds:schemaRefs>
+    <ds:schemaRef ds:uri="http://schemas.microsoft.com/sharepoint/v3/contenttype/forms"/>
+  </ds:schemaRefs>
+</ds:datastoreItem>
 </file>
 
-<file path=customXml/itemProps1.xml><?xml version="1.0" encoding="utf-8"?>
+<file path=customXml/itemProps3.xml><?xml version="1.0" encoding="utf-8"?>
 <ds:datastoreItem xmlns:ds="http://schemas.openxmlformats.org/officeDocument/2006/customXml" ds:itemID="{44B3D7BC-DC27-4E40-9F94-5873E4437891}">
   <ds:schemaRefs>
     <ds:schemaRef ds:uri="http://schemas.microsoft.com/office/2006/metadata/contentType"/>
@@ -2382,22 +2427,4 @@
     <ds:schemaRef ds:uri="http://schemas.microsoft.com/internal/obd"/>
   </ds:schemaRefs>
 </ds:datastoreItem>
-</file>
-
-<file path=customXml/itemProps2.xml><?xml version="1.0" encoding="utf-8"?>
-<ds:datastoreItem xmlns:ds="http://schemas.openxmlformats.org/officeDocument/2006/customXml" ds:itemID="{150D7E1B-4F1F-41DA-94CC-B34696FA2053}">
-  <ds:schemaRefs>
-    <ds:schemaRef ds:uri="http://schemas.microsoft.com/sharepoint/v3/contenttype/forms"/>
-  </ds:schemaRefs>
-</ds:datastoreItem>
-</file>
-
-<file path=customXml/itemProps3.xml><?xml version="1.0" encoding="utf-8"?>
-<ds:datastoreItem xmlns:ds="http://schemas.openxmlformats.org/officeDocument/2006/customXml" ds:itemID="{67B89194-640F-4DC2-878A-AA227FF81D19}">
-  <ds:schemaRefs>
-    <ds:schemaRef ds:uri="http://schemas.microsoft.com/office/2006/metadata/properties"/>
-    <ds:schemaRef ds:uri="http://schemas.microsoft.com/office/infopath/2007/PartnerControls"/>
-    <ds:schemaRef ds:uri="c76fba90-bd48-4e65-9fce-772627206c4f"/>
-  </ds:schemaRefs>
-</ds:datastoreItem>
 </file>
</xml_diff>